<commit_message>
Revert "Merge pull request #113 from GuardianMaua/thm_res_rontho14"
This reverts commit 9d4c7681ca51c3d9aafc6153fd650b1ec0081801, reversing
changes made to 5606406f24dd0e9a50ab26f4979c73f108164181.
</commit_message>
<xml_diff>
--- a/TryHackMe/skynet/rontho14/writeup.docx
+++ b/TryHackMe/skynet/rontho14/writeup.docx
@@ -106,7 +106,15 @@
           <w:sz w:val="32"/>
           <w:szCs w:val="32"/>
         </w:rPr>
-        <w:t xml:space="preserve"> – </w:t>
+        <w:t xml:space="preserve"> </w:t>
+      </w:r>
+      <w:r>
+        <w:rPr>
+          <w:rFonts w:ascii="Arial" w:eastAsia="Arial" w:hAnsi="Arial" w:cs="Arial"/>
+          <w:sz w:val="32"/>
+          <w:szCs w:val="32"/>
+        </w:rPr>
+        <w:t xml:space="preserve">– </w:t>
       </w:r>
       <w:proofErr w:type="spellStart"/>
       <w:r>
@@ -671,7 +679,7 @@
                 <w:sz w:val="24"/>
                 <w:szCs w:val="24"/>
               </w:rPr>
-              <w:t>Coordenador</w:t>
+              <w:t>Orientador</w:t>
             </w:r>
           </w:p>
         </w:tc>
@@ -765,7 +773,7 @@
                 <w:sz w:val="24"/>
                 <w:szCs w:val="24"/>
               </w:rPr>
-              <w:t>Coordenador</w:t>
+              <w:t>Diretor</w:t>
             </w:r>
           </w:p>
         </w:tc>
@@ -1082,7 +1090,7 @@
                 <w:sz w:val="24"/>
                 <w:szCs w:val="24"/>
               </w:rPr>
-              <w:t>23/03/2026</w:t>
+              <w:t>21/03/2026</w:t>
             </w:r>
           </w:p>
         </w:tc>
@@ -1176,7 +1184,7 @@
                 <w:sz w:val="24"/>
                 <w:szCs w:val="24"/>
               </w:rPr>
-              <w:t>23/03/2026</w:t>
+              <w:t>21/03/2026</w:t>
             </w:r>
           </w:p>
         </w:tc>
@@ -2340,32 +2348,6 @@
           <w:sz w:val="24"/>
           <w:szCs w:val="24"/>
         </w:rPr>
-        <w:br w:type="page"/>
-      </w:r>
-    </w:p>
-    <w:p>
-      <w:pPr>
-        <w:rPr>
-          <w:rFonts w:ascii="Arial" w:eastAsia="Arial" w:hAnsi="Arial" w:cs="Arial"/>
-          <w:sz w:val="24"/>
-          <w:szCs w:val="24"/>
-        </w:rPr>
-      </w:pPr>
-    </w:p>
-    <w:p>
-      <w:pPr>
-        <w:rPr>
-          <w:rFonts w:ascii="Arial" w:eastAsia="Arial" w:hAnsi="Arial" w:cs="Arial"/>
-          <w:sz w:val="24"/>
-          <w:szCs w:val="24"/>
-        </w:rPr>
-      </w:pPr>
-      <w:r>
-        <w:rPr>
-          <w:rFonts w:ascii="Arial" w:eastAsia="Arial" w:hAnsi="Arial" w:cs="Arial"/>
-          <w:sz w:val="24"/>
-          <w:szCs w:val="24"/>
-        </w:rPr>
         <w:t>Como http est</w:t>
       </w:r>
       <w:r>
@@ -2382,25 +2364,7 @@
           <w:sz w:val="24"/>
           <w:szCs w:val="24"/>
         </w:rPr>
-        <w:t xml:space="preserve"> aberto, coloquei o IP da </w:t>
-      </w:r>
-      <w:proofErr w:type="gramStart"/>
-      <w:r>
-        <w:rPr>
-          <w:rFonts w:ascii="Arial" w:eastAsia="Arial" w:hAnsi="Arial" w:cs="Arial"/>
-          <w:sz w:val="24"/>
-          <w:szCs w:val="24"/>
-        </w:rPr>
-        <w:t>maquina</w:t>
-      </w:r>
-      <w:proofErr w:type="gramEnd"/>
-      <w:r>
-        <w:rPr>
-          <w:rFonts w:ascii="Arial" w:eastAsia="Arial" w:hAnsi="Arial" w:cs="Arial"/>
-          <w:sz w:val="24"/>
-          <w:szCs w:val="24"/>
-        </w:rPr>
-        <w:t xml:space="preserve"> na web: </w:t>
+        <w:t xml:space="preserve"> aberto, coloquei o IP da maquina na web: </w:t>
       </w:r>
     </w:p>
     <w:p>
@@ -2425,6 +2389,7 @@
           <w:sz w:val="24"/>
           <w:szCs w:val="24"/>
         </w:rPr>
+        <w:lastRenderedPageBreak/>
         <w:drawing>
           <wp:anchor distT="0" distB="0" distL="0" distR="0" simplePos="0" relativeHeight="33" behindDoc="0" locked="0" layoutInCell="0" allowOverlap="1" wp14:anchorId="3583AA86" wp14:editId="17319D91">
             <wp:simplePos x="0" y="0"/>
@@ -2619,45 +2584,7 @@
           <w:sz w:val="24"/>
           <w:szCs w:val="24"/>
         </w:rPr>
-        <w:br w:type="page"/>
-      </w:r>
-    </w:p>
-    <w:p>
-      <w:pPr>
-        <w:rPr>
-          <w:rFonts w:ascii="Arial" w:eastAsia="Arial" w:hAnsi="Arial" w:cs="Arial"/>
-          <w:sz w:val="24"/>
-          <w:szCs w:val="24"/>
-        </w:rPr>
-      </w:pPr>
-    </w:p>
-    <w:p>
-      <w:pPr>
-        <w:rPr>
-          <w:rFonts w:ascii="Arial" w:eastAsia="Arial" w:hAnsi="Arial" w:cs="Arial"/>
-          <w:sz w:val="24"/>
-          <w:szCs w:val="24"/>
-        </w:rPr>
-      </w:pPr>
-      <w:proofErr w:type="spellStart"/>
-      <w:proofErr w:type="gramStart"/>
-      <w:r>
-        <w:rPr>
-          <w:rFonts w:ascii="Arial" w:eastAsia="Arial" w:hAnsi="Arial" w:cs="Arial"/>
-          <w:sz w:val="24"/>
-          <w:szCs w:val="24"/>
-        </w:rPr>
-        <w:t>Apos</w:t>
-      </w:r>
-      <w:proofErr w:type="spellEnd"/>
-      <w:proofErr w:type="gramEnd"/>
-      <w:r>
-        <w:rPr>
-          <w:rFonts w:ascii="Arial" w:eastAsia="Arial" w:hAnsi="Arial" w:cs="Arial"/>
-          <w:sz w:val="24"/>
-          <w:szCs w:val="24"/>
-        </w:rPr>
-        <w:t xml:space="preserve"> visitar alguns diret</w:t>
+        <w:t>Apos visitar alguns diret</w:t>
       </w:r>
       <w:r>
         <w:rPr>
@@ -2714,6 +2641,7 @@
           <w:sz w:val="24"/>
           <w:szCs w:val="24"/>
         </w:rPr>
+        <w:lastRenderedPageBreak/>
         <w:drawing>
           <wp:anchor distT="0" distB="0" distL="0" distR="0" simplePos="0" relativeHeight="36" behindDoc="0" locked="0" layoutInCell="0" allowOverlap="1" wp14:anchorId="134152E7" wp14:editId="4C1615EC">
             <wp:simplePos x="0" y="0"/>
@@ -2807,13 +2735,13 @@
           <w:szCs w:val="24"/>
         </w:rPr>
         <w:drawing>
-          <wp:anchor distT="0" distB="0" distL="0" distR="0" simplePos="0" relativeHeight="37" behindDoc="0" locked="0" layoutInCell="0" allowOverlap="1" wp14:anchorId="0653ECCF" wp14:editId="5717B4B4">
+          <wp:anchor distT="0" distB="0" distL="0" distR="0" simplePos="0" relativeHeight="37" behindDoc="0" locked="0" layoutInCell="0" allowOverlap="1" wp14:anchorId="0653ECCF" wp14:editId="130B3A99">
             <wp:simplePos x="0" y="0"/>
             <wp:positionH relativeFrom="margin">
               <wp:align>right</wp:align>
             </wp:positionH>
             <wp:positionV relativeFrom="paragraph">
-              <wp:posOffset>917731</wp:posOffset>
+              <wp:posOffset>2276475</wp:posOffset>
             </wp:positionV>
             <wp:extent cx="5400040" cy="2435860"/>
             <wp:effectExtent l="0" t="0" r="0" b="2540"/>
@@ -2859,7 +2787,25 @@
           <w:sz w:val="24"/>
           <w:szCs w:val="24"/>
         </w:rPr>
-        <w:t xml:space="preserve">Acessei o Metasploit para tentar encontrar vulnerabilidades do sistema. Rodei um nmap e salvei no arquivo scan.xml, com isso importei o documento para o </w:t>
+        <w:t xml:space="preserve">Acessei o </w:t>
+      </w:r>
+      <w:proofErr w:type="spellStart"/>
+      <w:r>
+        <w:rPr>
+          <w:rFonts w:ascii="Arial" w:eastAsia="Arial" w:hAnsi="Arial" w:cs="Arial"/>
+          <w:sz w:val="24"/>
+          <w:szCs w:val="24"/>
+        </w:rPr>
+        <w:t>Metasploit</w:t>
+      </w:r>
+      <w:proofErr w:type="spellEnd"/>
+      <w:r>
+        <w:rPr>
+          <w:rFonts w:ascii="Arial" w:eastAsia="Arial" w:hAnsi="Arial" w:cs="Arial"/>
+          <w:sz w:val="24"/>
+          <w:szCs w:val="24"/>
+        </w:rPr>
+        <w:t xml:space="preserve"> para tentar encontrar vulnerabilidades do sistema. Rodei um nmap e salvei no arquivo scan.xml, com isso importei o documento para o </w:t>
       </w:r>
       <w:proofErr w:type="spellStart"/>
       <w:r>
@@ -2922,7 +2868,7 @@
         </w:rPr>
         <w:lastRenderedPageBreak/>
         <w:drawing>
-          <wp:anchor distT="0" distB="0" distL="0" distR="0" simplePos="0" relativeHeight="39" behindDoc="0" locked="0" layoutInCell="0" allowOverlap="1" wp14:anchorId="777ECDC5" wp14:editId="56A8E538">
+          <wp:anchor distT="0" distB="0" distL="0" distR="0" simplePos="0" relativeHeight="39" behindDoc="0" locked="0" layoutInCell="0" allowOverlap="1" wp14:anchorId="777ECDC5" wp14:editId="6C1D74F7">
             <wp:simplePos x="0" y="0"/>
             <wp:positionH relativeFrom="column">
               <wp:align>center</wp:align>
@@ -2968,19 +2914,6 @@
           </wp:anchor>
         </w:drawing>
       </w:r>
-    </w:p>
-    <w:p>
-      <w:pPr>
-        <w:spacing w:after="0" w:line="360" w:lineRule="auto"/>
-        <w:rPr>
-          <w:rFonts w:ascii="Arial" w:eastAsia="Arial" w:hAnsi="Arial" w:cs="Arial"/>
-          <w:b/>
-          <w:smallCaps/>
-          <w:color w:val="000000"/>
-          <w:sz w:val="24"/>
-          <w:szCs w:val="24"/>
-        </w:rPr>
-      </w:pPr>
     </w:p>
     <w:p>
       <w:pPr>
@@ -3985,18 +3918,10 @@
           <w:szCs w:val="24"/>
         </w:rPr>
         <w:drawing>
-          <wp:anchor distT="0" distB="0" distL="0" distR="0" simplePos="0" relativeHeight="46" behindDoc="0" locked="0" layoutInCell="0" allowOverlap="1" wp14:anchorId="6037CF8B" wp14:editId="5821F50A">
-            <wp:simplePos x="0" y="0"/>
-            <wp:positionH relativeFrom="column">
-              <wp:align>center</wp:align>
-            </wp:positionH>
-            <wp:positionV relativeFrom="paragraph">
-              <wp:posOffset>635</wp:posOffset>
-            </wp:positionV>
-            <wp:extent cx="5400040" cy="1987550"/>
-            <wp:effectExtent l="0" t="0" r="0" b="0"/>
-            <wp:wrapSquare wrapText="largest"/>
-            <wp:docPr id="15" name="Image17"/>
+          <wp:inline distT="0" distB="0" distL="0" distR="0" wp14:anchorId="0257CBFB" wp14:editId="526C47F3">
+            <wp:extent cx="5400040" cy="1844040"/>
+            <wp:effectExtent l="0" t="0" r="0" b="3810"/>
+            <wp:docPr id="352493726" name="Imagem 1"/>
             <wp:cNvGraphicFramePr>
               <a:graphicFrameLocks xmlns:a="http://schemas.openxmlformats.org/drawingml/2006/main" noChangeAspect="1"/>
             </wp:cNvGraphicFramePr>
@@ -4004,10 +3929,8 @@
               <a:graphicData uri="http://schemas.openxmlformats.org/drawingml/2006/picture">
                 <pic:pic xmlns:pic="http://schemas.openxmlformats.org/drawingml/2006/picture">
                   <pic:nvPicPr>
-                    <pic:cNvPr id="15" name="Image17"/>
-                    <pic:cNvPicPr>
-                      <a:picLocks noChangeAspect="1" noChangeArrowheads="1"/>
-                    </pic:cNvPicPr>
+                    <pic:cNvPr id="352493726" name=""/>
+                    <pic:cNvPicPr/>
                   </pic:nvPicPr>
                   <pic:blipFill>
                     <a:blip r:embed="rId21"/>
@@ -4015,20 +3938,19 @@
                       <a:fillRect/>
                     </a:stretch>
                   </pic:blipFill>
-                  <pic:spPr bwMode="auto">
+                  <pic:spPr>
                     <a:xfrm>
                       <a:off x="0" y="0"/>
-                      <a:ext cx="5400040" cy="1987550"/>
+                      <a:ext cx="5400040" cy="1844040"/>
                     </a:xfrm>
                     <a:prstGeom prst="rect">
                       <a:avLst/>
                     </a:prstGeom>
-                    <a:noFill/>
                   </pic:spPr>
                 </pic:pic>
               </a:graphicData>
             </a:graphic>
-          </wp:anchor>
+          </wp:inline>
         </w:drawing>
       </w:r>
     </w:p>
@@ -4487,6 +4409,16 @@
           <w:szCs w:val="24"/>
         </w:rPr>
       </w:pPr>
+    </w:p>
+    <w:p>
+      <w:pPr>
+        <w:rPr>
+          <w:rFonts w:ascii="Arial" w:eastAsia="Arial" w:hAnsi="Arial" w:cs="Arial"/>
+          <w:sz w:val="24"/>
+          <w:szCs w:val="24"/>
+          <w:lang w:val="en-US"/>
+        </w:rPr>
+      </w:pPr>
       <w:proofErr w:type="spellStart"/>
       <w:r>
         <w:rPr>
@@ -4607,7 +4539,10 @@
           <w:lang w:val="en-US"/>
         </w:rPr>
       </w:pPr>
-      <w:r>
+    </w:p>
+    <w:p>
+      <w:pPr>
+        <w:spacing w:after="0" w:line="360" w:lineRule="auto"/>
         <w:rPr>
           <w:rFonts w:ascii="Arial" w:eastAsia="Arial" w:hAnsi="Arial" w:cs="Arial"/>
           <w:b/>
@@ -4617,8 +4552,7 @@
           <w:szCs w:val="24"/>
           <w:lang w:val="en-US"/>
         </w:rPr>
-        <w:br w:type="page"/>
-      </w:r>
+      </w:pPr>
     </w:p>
     <w:p>
       <w:pPr>
@@ -4647,7 +4581,10 @@
           <w:lang w:val="en-US"/>
         </w:rPr>
       </w:pPr>
-      <w:r>
+    </w:p>
+    <w:p>
+      <w:pPr>
+        <w:spacing w:after="0" w:line="360" w:lineRule="auto"/>
         <w:rPr>
           <w:rFonts w:ascii="Arial" w:eastAsia="Arial" w:hAnsi="Arial" w:cs="Arial"/>
           <w:b/>
@@ -4657,6 +4594,18 @@
           <w:szCs w:val="24"/>
           <w:lang w:val="en-US"/>
         </w:rPr>
+      </w:pPr>
+      <w:r>
+        <w:rPr>
+          <w:rFonts w:ascii="Arial" w:eastAsia="Arial" w:hAnsi="Arial" w:cs="Arial"/>
+          <w:b/>
+          <w:smallCaps/>
+          <w:color w:val="000000"/>
+          <w:sz w:val="24"/>
+          <w:szCs w:val="24"/>
+          <w:lang w:val="en-US"/>
+        </w:rPr>
+        <w:lastRenderedPageBreak/>
         <w:t>What is the vulnerability called when you can include a remote file for malicious purposes?</w:t>
       </w:r>
     </w:p>
@@ -7422,9 +7371,9 @@
 <file path=word/numbering.xml><?xml version="1.0" encoding="utf-8"?>
 <w:numbering xmlns:wpc="http://schemas.microsoft.com/office/word/2010/wordprocessingCanvas" xmlns:cx="http://schemas.microsoft.com/office/drawing/2014/chartex" xmlns:cx1="http://schemas.microsoft.com/office/drawing/2015/9/8/chartex" xmlns:cx2="http://schemas.microsoft.com/office/drawing/2015/10/21/chartex" xmlns:cx3="http://schemas.microsoft.com/office/drawing/2016/5/9/chartex" xmlns:cx4="http://schemas.microsoft.com/office/drawing/2016/5/10/chartex" xmlns:cx5="http://schemas.microsoft.com/office/drawing/2016/5/11/chartex" xmlns:cx6="http://schemas.microsoft.com/office/drawing/2016/5/12/chartex" xmlns:cx7="http://schemas.microsoft.com/office/drawing/2016/5/13/chartex" xmlns:cx8="http://schemas.microsoft.com/office/drawing/2016/5/14/chartex" xmlns:mc="http://schemas.openxmlformats.org/markup-compatibility/2006" xmlns:aink="http://schemas.microsoft.com/office/drawing/2016/ink" xmlns:am3d="http://schemas.microsoft.com/office/drawing/2017/model3d" xmlns:o="urn:schemas-microsoft-com:office:office" xmlns:oel="http://schemas.microsoft.com/office/2019/extlst" xmlns:r="http://schemas.openxmlformats.org/officeDocument/2006/relationships" xmlns:m="http://schemas.openxmlformats.org/officeDocument/2006/math" xmlns:v="urn:schemas-microsoft-com:vml" xmlns:wp14="http://schemas.microsoft.com/office/word/2010/wordprocessingDrawing" xmlns:wp="http://schemas.openxmlformats.org/drawingml/2006/wordprocessingDrawing" xmlns:w10="urn:schemas-microsoft-com:office:word" xmlns:w="http://schemas.openxmlformats.org/wordprocessingml/2006/main" xmlns:w14="http://schemas.microsoft.com/office/word/2010/wordml" xmlns:w15="http://schemas.microsoft.com/office/word/2012/wordml" xmlns:w16cex="http://schemas.microsoft.com/office/word/2018/wordml/cex" xmlns:w16cid="http://schemas.microsoft.com/office/word/2016/wordml/cid" xmlns:w16="http://schemas.microsoft.com/office/word/2018/wordml" xmlns:w16du="http://schemas.microsoft.com/office/word/2023/wordml/word16du" xmlns:w16sdtdh="http://schemas.microsoft.com/office/word/2020/wordml/sdtdatahash" xmlns:w16sdtfl="http://schemas.microsoft.com/office/word/2024/wordml/sdtformatlock" xmlns:w16se="http://schemas.microsoft.com/office/word/2015/wordml/symex" xmlns:wpg="http://schemas.microsoft.com/office/word/2010/wordprocessingGroup" xmlns:wpi="http://schemas.microsoft.com/office/word/2010/wordprocessingInk" xmlns:wne="http://schemas.microsoft.com/office/word/2006/wordml" xmlns:wps="http://schemas.microsoft.com/office/word/2010/wordprocessingShape" mc:Ignorable="w14 w15 w16se w16cid w16 w16cex w16sdtdh w16sdtfl w16du wp14">
   <w:abstractNum w:abstractNumId="0" w15:restartNumberingAfterBreak="0">
-    <w:nsid w:val="198B1D76"/>
+    <w:nsid w:val="2B9F1E47"/>
     <w:multiLevelType w:val="hybridMultilevel"/>
-    <w:tmpl w:val="0F06B5BE"/>
+    <w:tmpl w:val="A8649BD4"/>
     <w:lvl w:ilvl="0" w:tplc="04160001">
       <w:start w:val="1"/>
       <w:numFmt w:val="bullet"/>
@@ -7534,7 +7483,7 @@
       </w:rPr>
     </w:lvl>
   </w:abstractNum>
-  <w:num w:numId="1" w16cid:durableId="1787894145">
+  <w:num w:numId="1" w16cid:durableId="1963073245">
     <w:abstractNumId w:val="0"/>
   </w:num>
 </w:numbering>

</xml_diff>